<commit_message>
docs: polish portfolio presentation and thesis
</commit_message>
<xml_diff>
--- a/docs/thesis/final-thesis.docx
+++ b/docs/thesis/final-thesis.docx
@@ -4176,14 +4176,14 @@
             <w:rStyle w:val="Hyperlink"/>
             <w:noProof/>
           </w:rPr>
-          <w:t xml:space="preserve">4.9 </w:t>
+          <w:t xml:space="preserve">4.9 本地小模型测试结果24</w:t>
         </w:r>
         <w:r>
           <w:rPr>
             <w:rStyle w:val="Hyperlink"/>
             <w:noProof/>
           </w:rPr>
-          <w:t>本地小模型探索实现</w:t>
+          <w:t/>
         </w:r>
         <w:r>
           <w:rPr>
@@ -4224,7 +4224,7 @@
             <w:noProof/>
             <w:webHidden/>
           </w:rPr>
-          <w:t>24</w:t>
+          <w:t/>
         </w:r>
         <w:r>
           <w:rPr>
@@ -5840,118 +5840,118 @@
         <w:ind w:firstLine="480"/>
       </w:pPr>
       <w:r>
-        <w:t>PCA9685</w:t>
-      </w:r>
-      <w:r>
-        <w:t>是一款通过</w:t>
-      </w:r>
-      <w:r>
-        <w:t>I2C</w:t>
-      </w:r>
-      <w:r>
-        <w:t>控制的多通道</w:t>
-      </w:r>
-      <w:r>
-        <w:t>PWM</w:t>
-      </w:r>
-      <w:r>
-        <w:t>驱动芯片，常用于多个舵机的控制。本文选用</w:t>
-      </w:r>
-      <w:r>
-        <w:t>PCA9685</w:t>
-      </w:r>
-      <w:r>
-        <w:t>而不是直接使用树莓派</w:t>
-      </w:r>
-      <w:r>
-        <w:t>GPIO</w:t>
-      </w:r>
-      <w:r>
-        <w:t>输出</w:t>
-      </w:r>
-      <w:r>
-        <w:t>PWM</w:t>
-      </w:r>
-      <w:r>
-        <w:t>，主要原因包括：树莓派可用硬件</w:t>
-      </w:r>
-      <w:r>
-        <w:t>PWM</w:t>
-      </w:r>
-      <w:r>
-        <w:t>通道有限，软件</w:t>
-      </w:r>
-      <w:r>
-        <w:t>PWM</w:t>
-      </w:r>
-      <w:r>
-        <w:t>容易受系统调度影响产生抖动，多个舵机同时控制会增加</w:t>
-      </w:r>
-      <w:r>
-        <w:t>CPU</w:t>
-      </w:r>
-      <w:r>
-        <w:t>负担，而</w:t>
-      </w:r>
-      <w:r>
-        <w:t>PCA9685</w:t>
-      </w:r>
-      <w:r>
-        <w:t>可以提供</w:t>
-      </w:r>
-      <w:r>
-        <w:t>16</w:t>
-      </w:r>
-      <w:r>
-        <w:t>路独立</w:t>
-      </w:r>
-      <w:r>
-        <w:t>PWM</w:t>
-      </w:r>
-      <w:r>
-        <w:t>输出，并通过</w:t>
-      </w:r>
-      <w:r>
-        <w:t>I2C</w:t>
-      </w:r>
-      <w:r>
-        <w:t>总线统一配置占空比。本项目中底盘舵机预设为</w:t>
-      </w:r>
-      <w:r>
-        <w:t>0</w:t>
-      </w:r>
-      <w:r>
-        <w:t>号通道，耳朵舵机预留</w:t>
-      </w:r>
-      <w:r>
-        <w:t>2</w:t>
-      </w:r>
-      <w:r>
-        <w:t>号和</w:t>
-      </w:r>
-      <w:r>
-        <w:t>3</w:t>
-      </w:r>
-      <w:r>
-        <w:t>号通道。舵机不能直接由树莓派</w:t>
-      </w:r>
-      <w:r>
-        <w:t>5V</w:t>
-      </w:r>
-      <w:r>
-        <w:t>引脚供电，应使用外部舵机电源，并保证树莓派、</w:t>
-      </w:r>
-      <w:r>
-        <w:t>PCA9685</w:t>
-      </w:r>
-      <w:r>
-        <w:t>和外部电源共地。由于旧</w:t>
-      </w:r>
-      <w:r>
-        <w:t>PCA9685</w:t>
-      </w:r>
-      <w:r>
-        <w:t>板曾出现烧毁痕迹，当前系统默认关闭硬件舵机服务，等待替换硬件并完成安全测试后再启用。</w:t>
+        <w:t>PCA9685是一款通过I2C控制的多通道PWM驱动芯片，常用于多个舵机的控制。本文选用PCA9685而不是直接使用树莓派GPIO输出PWM，主要原因包括：树莓派可用硬件PWM通道有限，软件PWM容易受系统调度影响产生抖动，多个舵机同时控制会增加CPU负担，而PCA9685可以提供16路独立PWM输出，并通过I2C总线统一配置占空比。本项目中底盘舵机使用0号通道，左右耳朵舵机使用2号和3号通道。舵机不能直接由树莓派5V引脚供电，应使用外部舵机电源，并保证树莓派、PCA9685和外部电源共地。替换后的PCA9685板已按I2C地址检测、外部电源空载检查和单舵机小角度测试的顺序重新验证，后端服务通过配置开关统一管理底盘跟踪和耳朵动作，避免外部工具直接驱动硬件。</w:t>
+      </w:r>
+      <w:r>
+        <w:t/>
+      </w:r>
+      <w:r>
+        <w:t/>
+      </w:r>
+      <w:r>
+        <w:t/>
+      </w:r>
+      <w:r>
+        <w:t/>
+      </w:r>
+      <w:r>
+        <w:t/>
+      </w:r>
+      <w:r>
+        <w:t/>
+      </w:r>
+      <w:r>
+        <w:t/>
+      </w:r>
+      <w:r>
+        <w:t/>
+      </w:r>
+      <w:r>
+        <w:t/>
+      </w:r>
+      <w:r>
+        <w:t/>
+      </w:r>
+      <w:r>
+        <w:t/>
+      </w:r>
+      <w:r>
+        <w:t/>
+      </w:r>
+      <w:r>
+        <w:t/>
+      </w:r>
+      <w:r>
+        <w:t/>
+      </w:r>
+      <w:r>
+        <w:t/>
+      </w:r>
+      <w:r>
+        <w:t/>
+      </w:r>
+      <w:r>
+        <w:t/>
+      </w:r>
+      <w:r>
+        <w:t/>
+      </w:r>
+      <w:r>
+        <w:t/>
+      </w:r>
+      <w:r>
+        <w:t/>
+      </w:r>
+      <w:r>
+        <w:t/>
+      </w:r>
+      <w:r>
+        <w:t/>
+      </w:r>
+      <w:r>
+        <w:t/>
+      </w:r>
+      <w:r>
+        <w:t/>
+      </w:r>
+      <w:r>
+        <w:t/>
+      </w:r>
+      <w:r>
+        <w:t/>
+      </w:r>
+      <w:r>
+        <w:t/>
+      </w:r>
+      <w:r>
+        <w:t/>
+      </w:r>
+      <w:r>
+        <w:t/>
+      </w:r>
+      <w:r>
+        <w:t/>
+      </w:r>
+      <w:r>
+        <w:t/>
+      </w:r>
+      <w:r>
+        <w:t/>
+      </w:r>
+      <w:r>
+        <w:t/>
+      </w:r>
+      <w:r>
+        <w:t/>
+      </w:r>
+      <w:r>
+        <w:t/>
+      </w:r>
+      <w:r>
+        <w:t/>
+      </w:r>
+      <w:r>
+        <w:t/>
       </w:r>
     </w:p>
     <w:p ns2:paraId="07DDB5E4" ns2:textId="77777777">
@@ -6056,67 +6056,67 @@
         <w:rPr>
           <w:rFonts w:hint="eastAsia"/>
         </w:rPr>
-        <w:t>根据“二次元萌宠具身智能系统研发”的课题目标，系统需要满足功能性需求、具身交互需求和非功能性需求三类要求。功能性需求包括语音唤醒、语音输入、视觉问答、</w:t>
-      </w:r>
-      <w:r>
-        <w:rPr>
-          <w:rFonts w:hint="eastAsia"/>
-        </w:rPr>
-        <w:t>AI</w:t>
-      </w:r>
-      <w:r>
-        <w:rPr>
-          <w:rFonts w:hint="eastAsia"/>
-        </w:rPr>
-        <w:t>回复、语音播放、前端表情反馈、历史会话能力和可选舵机动作。具身交互需求要求系统形成“感知</w:t>
-      </w:r>
-      <w:r>
-        <w:rPr>
-          <w:rFonts w:hint="eastAsia"/>
-        </w:rPr>
-        <w:t>-</w:t>
-      </w:r>
-      <w:r>
-        <w:rPr>
-          <w:rFonts w:hint="eastAsia"/>
-        </w:rPr>
-        <w:t>认知</w:t>
-      </w:r>
-      <w:r>
-        <w:rPr>
-          <w:rFonts w:hint="eastAsia"/>
-        </w:rPr>
-        <w:t>-</w:t>
-      </w:r>
-      <w:r>
-        <w:rPr>
-          <w:rFonts w:hint="eastAsia"/>
-        </w:rPr>
-        <w:t>表达</w:t>
-      </w:r>
-      <w:r>
-        <w:rPr>
-          <w:rFonts w:hint="eastAsia"/>
-        </w:rPr>
-        <w:t>-</w:t>
-      </w:r>
-      <w:r>
-        <w:rPr>
-          <w:rFonts w:hint="eastAsia"/>
-        </w:rPr>
-        <w:t>执行”的闭环：通过麦克风和摄像头感知用户，通过视觉语言模型完成认知推理，通过二次元眼睛表情和语音表达状态，通过舵机回转结构提供实体动作反馈。非功能性需求包括部署简单、运行稳定、响应时间可接受、硬件安全、配置可修改和对网络异常具备一定容错能力。</w:t>
-      </w:r>
-      <w:r>
-        <w:rPr>
-          <w:rFonts w:hint="eastAsia"/>
-        </w:rPr>
-        <w:t>具体系统主要需求</w:t>
-      </w:r>
-      <w:r>
-        <w:rPr>
-          <w:rFonts w:hint="eastAsia"/>
-        </w:rPr>
-        <w:t>如</w:t>
+        <w:t>根据“二次元萌宠具身智能系统研发”的课题目标，系统需要满足功能性需求、具身交互需求和非功能性需求三类要求。功能性需求包括语音唤醒、语音输入、视觉问答、AI回复、语音播放、前端表情反馈、历史会话能力和可选舵机动作。具身交互需求要求系统形成“感知-认知-表达-执行”的闭环：通过麦克风和摄像头感知用户，通过视觉语言模型完成认知推理，通过二次元眼睛表情和语音表达状态，通过舵机回转结构提供实体动作反馈。非功能性需求包括部署简单、运行稳定、响应时间可接受、硬件安全、配置可修改和对网络异常具备一定容错能力。具体系统主要需求如表3-1所示。</w:t>
+      </w:r>
+      <w:r>
+        <w:rPr>
+          <w:rFonts w:hint="eastAsia"/>
+        </w:rPr>
+        <w:t/>
+      </w:r>
+      <w:r>
+        <w:rPr>
+          <w:rFonts w:hint="eastAsia"/>
+        </w:rPr>
+        <w:t/>
+      </w:r>
+      <w:r>
+        <w:rPr>
+          <w:rFonts w:hint="eastAsia"/>
+        </w:rPr>
+        <w:t/>
+      </w:r>
+      <w:r>
+        <w:rPr>
+          <w:rFonts w:hint="eastAsia"/>
+        </w:rPr>
+        <w:t/>
+      </w:r>
+      <w:r>
+        <w:rPr>
+          <w:rFonts w:hint="eastAsia"/>
+        </w:rPr>
+        <w:t/>
+      </w:r>
+      <w:r>
+        <w:rPr>
+          <w:rFonts w:hint="eastAsia"/>
+        </w:rPr>
+        <w:t/>
+      </w:r>
+      <w:r>
+        <w:rPr>
+          <w:rFonts w:hint="eastAsia"/>
+        </w:rPr>
+        <w:t/>
+      </w:r>
+      <w:r>
+        <w:rPr>
+          <w:rFonts w:hint="eastAsia"/>
+        </w:rPr>
+        <w:t/>
+      </w:r>
+      <w:r>
+        <w:rPr>
+          <w:rFonts w:hint="eastAsia"/>
+        </w:rPr>
+        <w:t/>
+      </w:r>
+      <w:r>
+        <w:rPr>
+          <w:rFonts w:hint="eastAsia"/>
+        </w:rPr>
+        <w:t/>
       </w:r>
       <w:r>
         <w:fldChar w:fldCharType="begin"/>
@@ -6140,13 +6140,13 @@
         <w:rPr>
           <w:rFonts w:hint="eastAsia"/>
         </w:rPr>
-        <w:t>表</w:t>
-      </w:r>
-      <w:r>
-        <w:rPr>
-          <w:rFonts w:hint="eastAsia"/>
-        </w:rPr>
-        <w:t>3</w:t>
+        <w:t/>
+      </w:r>
+      <w:r>
+        <w:rPr>
+          <w:rFonts w:hint="eastAsia"/>
+        </w:rPr>
+        <w:t/>
       </w:r>
       <w:r>
         <w:noBreakHyphen/>
@@ -6155,7 +6155,7 @@
         <w:rPr>
           <w:noProof/>
         </w:rPr>
-        <w:t>1</w:t>
+        <w:t/>
       </w:r>
       <w:r>
         <w:fldChar w:fldCharType="end"/>
@@ -6164,7 +6164,7 @@
         <w:rPr>
           <w:rFonts w:hint="eastAsia"/>
         </w:rPr>
-        <w:t>所示。</w:t>
+        <w:t/>
       </w:r>
     </w:p>
     <w:p ns2:paraId="56FEA97D" ns2:textId="3F08385C">
@@ -6178,13 +6178,13 @@
         <w:rPr>
           <w:rFonts w:hint="eastAsia"/>
         </w:rPr>
-        <w:t>表</w:t>
-      </w:r>
-      <w:r>
-        <w:rPr>
-          <w:rFonts w:hint="eastAsia"/>
-        </w:rPr>
-        <w:t>3</w:t>
+        <w:t>表3-1 系统主要需求</w:t>
+      </w:r>
+      <w:r>
+        <w:rPr>
+          <w:rFonts w:hint="eastAsia"/>
+        </w:rPr>
+        <w:t/>
       </w:r>
       <w:r>
         <w:noBreakHyphen/>
@@ -6195,7 +6195,7 @@
             <w:rFonts w:hint="eastAsia"/>
             <w:noProof/>
           </w:rPr>
-          <w:t>三</w:t>
+          <w:t/>
         </w:r>
       </w:fldSimple>
       <w:r>
@@ -6220,7 +6220,7 @@
         <w:rPr>
           <w:noProof/>
         </w:rPr>
-        <w:t>1</w:t>
+        <w:t/>
       </w:r>
       <w:r>
         <w:fldChar w:fldCharType="end"/>
@@ -6231,7 +6231,7 @@
           <w:rFonts w:hint="eastAsia"/>
           <w:noProof/>
         </w:rPr>
-        <w:t xml:space="preserve"> </w:t>
+        <w:t xml:space="preserve"/>
       </w:r>
       <w:bookmarkEnd w:id="29"/>
       <w:r>
@@ -6239,7 +6239,7 @@
           <w:rFonts w:hint="eastAsia"/>
           <w:noProof/>
         </w:rPr>
-        <w:t>系统主要需求</w:t>
+        <w:t/>
       </w:r>
     </w:p>
     <w:tbl>
@@ -7100,19 +7100,19 @@
         <w:ind w:firstLine="480"/>
       </w:pPr>
       <w:r>
-        <w:t>模型推理链路采用</w:t>
-      </w:r>
-      <w:r>
-        <w:t>Agent</w:t>
-      </w:r>
-      <w:r>
-        <w:t>抽象。用户输入经过处理后被组织为包含文本和可选图像的统一输入对象，</w:t>
-      </w:r>
-      <w:r>
-        <w:t>Agent</w:t>
-      </w:r>
-      <w:r>
-        <w:t>输出则被转换为文本句子或音频片段。该抽象隐藏了不同模型提供商和不同输入模态之间的差异，使后端对话流程保持一致。</w:t>
+        <w:t>模型推理链路采用Agent抽象。用户输入经过处理后被组织为包含文本和可选图像的统一输入对象，Agent输出则被转换为文本句子或音频片段。该抽象隐藏了不同模型提供商和不同输入模态之间的差异，使后端对话流程保持一致。图3-1为系统总体架构图。</w:t>
+      </w:r>
+      <w:r>
+        <w:t/>
+      </w:r>
+      <w:r>
+        <w:t/>
+      </w:r>
+      <w:r>
+        <w:t/>
+      </w:r>
+      <w:r>
+        <w:t/>
       </w:r>
       <w:r>
         <w:fldChar w:fldCharType="begin"/>
@@ -7127,10 +7127,10 @@
         <w:rPr>
           <w:rFonts w:hint="eastAsia"/>
         </w:rPr>
-        <w:t>图</w:t>
-      </w:r>
-      <w:r>
-        <w:t>3</w:t>
+        <w:t/>
+      </w:r>
+      <w:r>
+        <w:t/>
       </w:r>
       <w:r>
         <w:noBreakHyphen/>
@@ -7139,7 +7139,7 @@
         <w:rPr>
           <w:noProof/>
         </w:rPr>
-        <w:t>1</w:t>
+        <w:t/>
       </w:r>
       <w:r>
         <w:fldChar w:fldCharType="end"/>
@@ -7148,19 +7148,19 @@
         <w:rPr>
           <w:rFonts w:hint="eastAsia"/>
         </w:rPr>
-        <w:t>为</w:t>
-      </w:r>
-      <w:r>
-        <w:rPr>
-          <w:rFonts w:hint="eastAsia"/>
-        </w:rPr>
-        <w:t>系统总体架构图</w:t>
-      </w:r>
-      <w:r>
-        <w:rPr>
-          <w:rFonts w:hint="eastAsia"/>
-        </w:rPr>
-        <w:t>。</w:t>
+        <w:t/>
+      </w:r>
+      <w:r>
+        <w:rPr>
+          <w:rFonts w:hint="eastAsia"/>
+        </w:rPr>
+        <w:t/>
+      </w:r>
+      <w:r>
+        <w:rPr>
+          <w:rFonts w:hint="eastAsia"/>
+        </w:rPr>
+        <w:t/>
       </w:r>
     </w:p>
     <w:p ns2:paraId="5C7B5779" ns2:textId="77777777">
@@ -7227,10 +7227,10 @@
         <w:rPr>
           <w:rFonts w:hint="eastAsia"/>
         </w:rPr>
-        <w:t>图</w:t>
-      </w:r>
-      <w:r>
-        <w:t>3</w:t>
+        <w:t>图3-1 系统总体架构图</w:t>
+      </w:r>
+      <w:r>
+        <w:t/>
       </w:r>
       <w:r>
         <w:noBreakHyphen/>
@@ -7254,21 +7254,21 @@
         <w:rPr>
           <w:noProof/>
         </w:rPr>
-        <w:t>1</w:t>
+        <w:t/>
       </w:r>
       <w:r>
         <w:fldChar w:fldCharType="end"/>
       </w:r>
       <w:bookmarkEnd w:id="33"/>
       <w:r>
-        <w:t xml:space="preserve"> </w:t>
+        <w:t xml:space="preserve"/>
       </w:r>
       <w:bookmarkEnd w:id="34"/>
       <w:r>
         <w:rPr>
           <w:rFonts w:hint="eastAsia"/>
         </w:rPr>
-        <w:t>系统总体架构图</w:t>
+        <w:t/>
       </w:r>
     </w:p>
     <w:p ns2:paraId="2C827FD2" ns2:textId="7723AF11">
@@ -8696,19 +8696,19 @@
         <w:ind w:firstLine="480"/>
       </w:pPr>
       <w:r>
-        <w:t>情绪映射模块负责监听后端状态消息并更新表情状态。对话开始时进入思考状态，模型回复携带积极、悲伤、愤怒、惊讶等情绪标签时，系统分别映射到对应的眼睛和眉毛表情；未检测到情绪标签或会话结束后回到中性状态。该映射关系使表情系统可以脱离具体</w:t>
-      </w:r>
-      <w:r>
-        <w:t>Live2D</w:t>
-      </w:r>
-      <w:r>
-        <w:t>模型独立运行，提高了树莓派显示端的鲁棒性。</w:t>
-      </w:r>
-      <w:r>
-        <w:rPr>
-          <w:rFonts w:hint="eastAsia"/>
-        </w:rPr>
-        <w:t>具体的表情如</w:t>
+        <w:t>情绪映射模块负责监听后端状态消息并更新表情状态。对话开始时进入思考状态，模型回复携带积极、悲伤、愤怒、惊讶等情绪标签时，系统分别映射到对应的眼睛和眉毛表情；未检测到情绪标签或会话结束后回到中性状态。该映射关系使表情系统可以脱离具体Live2D模型独立运行，提高了树莓派显示端的鲁棒性。具体的表情如图3-2所示。</w:t>
+      </w:r>
+      <w:r>
+        <w:t/>
+      </w:r>
+      <w:r>
+        <w:t/>
+      </w:r>
+      <w:r>
+        <w:rPr>
+          <w:rFonts w:hint="eastAsia"/>
+        </w:rPr>
+        <w:t/>
       </w:r>
       <w:r>
         <w:fldChar w:fldCharType="begin"/>
@@ -8732,13 +8732,13 @@
         <w:rPr>
           <w:rFonts w:asciiTheme="minorEastAsia" w:eastAsiaTheme="minorEastAsia" w:hAnsiTheme="minorEastAsia" w:hint="eastAsia"/>
         </w:rPr>
-        <w:t xml:space="preserve">图 </w:t>
+        <w:t xml:space="preserve"/>
       </w:r>
       <w:r>
         <w:rPr>
           <w:rFonts w:asciiTheme="minorEastAsia" w:eastAsiaTheme="minorEastAsia" w:hAnsiTheme="minorEastAsia" w:hint="eastAsia"/>
         </w:rPr>
-        <w:t>3</w:t>
+        <w:t/>
       </w:r>
       <w:r>
         <w:rPr>
@@ -8751,7 +8751,7 @@
           <w:rFonts w:asciiTheme="minorEastAsia" w:eastAsiaTheme="minorEastAsia" w:hAnsiTheme="minorEastAsia"/>
           <w:noProof/>
         </w:rPr>
-        <w:t>2</w:t>
+        <w:t/>
       </w:r>
       <w:r>
         <w:fldChar w:fldCharType="end"/>
@@ -8760,7 +8760,7 @@
         <w:rPr>
           <w:rFonts w:hint="eastAsia"/>
         </w:rPr>
-        <w:t>所示。</w:t>
+        <w:t/>
       </w:r>
     </w:p>
     <w:p ns2:paraId="558D4A8B" ns2:textId="77777777">
@@ -8822,13 +8822,13 @@
         <w:rPr>
           <w:rFonts w:asciiTheme="minorEastAsia" w:eastAsiaTheme="minorEastAsia" w:hAnsiTheme="minorEastAsia" w:hint="eastAsia"/>
         </w:rPr>
-        <w:t xml:space="preserve">图 </w:t>
+        <w:t xml:space="preserve">图3-2 各情绪表情样式</w:t>
       </w:r>
       <w:r>
         <w:rPr>
           <w:rFonts w:asciiTheme="minorEastAsia" w:eastAsiaTheme="minorEastAsia" w:hAnsiTheme="minorEastAsia" w:hint="eastAsia"/>
         </w:rPr>
-        <w:t>3</w:t>
+        <w:t/>
       </w:r>
       <w:r>
         <w:rPr>
@@ -8871,7 +8871,7 @@
           <w:rFonts w:asciiTheme="minorEastAsia" w:eastAsiaTheme="minorEastAsia" w:hAnsiTheme="minorEastAsia"/>
           <w:noProof/>
         </w:rPr>
-        <w:t>2</w:t>
+        <w:t/>
       </w:r>
       <w:r>
         <w:rPr>
@@ -8884,7 +8884,7 @@
         <w:rPr>
           <w:rFonts w:asciiTheme="minorEastAsia" w:eastAsiaTheme="minorEastAsia" w:hAnsiTheme="minorEastAsia" w:hint="eastAsia"/>
         </w:rPr>
-        <w:t xml:space="preserve"> 各情绪表情样式</w:t>
+        <w:t xml:space="preserve"/>
       </w:r>
     </w:p>
     <w:p ns2:paraId="4E7A5110" ns2:textId="77777777">
@@ -8938,16 +8938,16 @@
           <w:rFonts w:hint="eastAsia"/>
         </w:rPr>
         <w:lastRenderedPageBreak/>
-        <w:t>表</w:t>
-      </w:r>
-      <w:r>
-        <w:rPr>
-          <w:rFonts w:hint="eastAsia"/>
-        </w:rPr>
-        <w:t xml:space="preserve"> </w:t>
-      </w:r>
-      <w:r>
-        <w:t>3</w:t>
+        <w:t>表3-2 表情状态映射关系</w:t>
+      </w:r>
+      <w:r>
+        <w:rPr>
+          <w:rFonts w:hint="eastAsia"/>
+        </w:rPr>
+        <w:t xml:space="preserve"/>
+      </w:r>
+      <w:r>
+        <w:t/>
       </w:r>
       <w:r>
         <w:noBreakHyphen/>
@@ -8958,7 +8958,7 @@
             <w:rFonts w:hint="eastAsia"/>
             <w:noProof/>
           </w:rPr>
-          <w:t>三</w:t>
+          <w:t/>
         </w:r>
       </w:fldSimple>
       <w:r>
@@ -8983,17 +8983,17 @@
         <w:rPr>
           <w:noProof/>
         </w:rPr>
-        <w:t>2</w:t>
+        <w:t/>
       </w:r>
       <w:r>
         <w:fldChar w:fldCharType="end"/>
       </w:r>
       <w:bookmarkEnd w:id="40"/>
       <w:r>
-        <w:t xml:space="preserve"> </w:t>
-      </w:r>
-      <w:r>
-        <w:t>表情状态映射关系</w:t>
+        <w:t xml:space="preserve"/>
+      </w:r>
+      <w:r>
+        <w:t/>
       </w:r>
     </w:p>
     <w:tbl>
@@ -9943,73 +9943,73 @@
         <w:jc w:val="left"/>
       </w:pPr>
       <w:r>
-        <w:t>动力传递采用定齿轮反作用驱动方式。</w:t>
-      </w:r>
-      <w:r>
-        <w:t>DS3120</w:t>
-      </w:r>
-      <w:r>
-        <w:t>舵机固定在旋转上板上，舵机轴安装</w:t>
-      </w:r>
-      <w:r>
-        <w:t>40</w:t>
-      </w:r>
-      <w:r>
-        <w:t>齿小齿轮；</w:t>
-      </w:r>
-      <w:r>
-        <w:rPr>
-          <w:rFonts w:hint="eastAsia"/>
-        </w:rPr>
-        <w:t>60</w:t>
-      </w:r>
-      <w:r>
-        <w:t>齿大齿轮固定在静止下板上。当舵机驱动小齿轮转动时，小齿轮与固定大齿轮啮合，由于大齿轮不可转动，反作用力会推动舵机本体连同上板和头部外壳绕</w:t>
-      </w:r>
-      <w:r>
-        <w:t>M8</w:t>
-      </w:r>
-      <w:r>
-        <w:t>中心轴旋转。大小齿轮</w:t>
-      </w:r>
-      <w:r>
-        <w:rPr>
-          <w:rFonts w:hint="eastAsia"/>
-        </w:rPr>
-        <w:t>的</w:t>
-      </w:r>
-      <w:r>
-        <w:t>传动比为</w:t>
-      </w:r>
-      <w:r>
-        <w:t>1:1</w:t>
-      </w:r>
-      <w:r>
-        <w:rPr>
-          <w:rFonts w:hint="eastAsia"/>
-        </w:rPr>
-        <w:t>.5</w:t>
-      </w:r>
-      <w:r>
-        <w:t>，舵机输出角度与头部旋转角度近似一致，便于软件控制角度映射。</w:t>
-      </w:r>
-      <w:r>
-        <w:rPr>
-          <w:rFonts w:hint="eastAsia"/>
-        </w:rPr>
-        <w:t>具体的</w:t>
-      </w:r>
-      <w:r>
-        <w:rPr>
-          <w:rFonts w:hint="eastAsia"/>
-        </w:rPr>
-        <w:t>机器人总装结构示意图</w:t>
-      </w:r>
-      <w:r>
-        <w:rPr>
-          <w:rFonts w:hint="eastAsia"/>
-        </w:rPr>
-        <w:t>如</w:t>
+        <w:t>动力传递采用定齿轮反作用驱动方式。DS3120舵机固定在旋转上板上，舵机轴安装40齿小齿轮；60齿大齿轮固定在静止下板上。当舵机驱动小齿轮转动时，小齿轮与固定大齿轮啮合，由于大齿轮不可转动，反作用力会推动舵机本体连同上板和头部外壳绕M8中心轴旋转。大小齿轮的传动比为1:1.5，舵机输出角度与头部旋转角度近似一致，便于软件控制角度映射。具体的机器人总装结构示意图如图3-3所示。</w:t>
+      </w:r>
+      <w:r>
+        <w:t/>
+      </w:r>
+      <w:r>
+        <w:t/>
+      </w:r>
+      <w:r>
+        <w:t/>
+      </w:r>
+      <w:r>
+        <w:t/>
+      </w:r>
+      <w:r>
+        <w:rPr>
+          <w:rFonts w:hint="eastAsia"/>
+        </w:rPr>
+        <w:t/>
+      </w:r>
+      <w:r>
+        <w:t/>
+      </w:r>
+      <w:r>
+        <w:t/>
+      </w:r>
+      <w:r>
+        <w:t/>
+      </w:r>
+      <w:r>
+        <w:rPr>
+          <w:rFonts w:hint="eastAsia"/>
+        </w:rPr>
+        <w:t/>
+      </w:r>
+      <w:r>
+        <w:t/>
+      </w:r>
+      <w:r>
+        <w:t/>
+      </w:r>
+      <w:r>
+        <w:rPr>
+          <w:rFonts w:hint="eastAsia"/>
+        </w:rPr>
+        <w:t/>
+      </w:r>
+      <w:r>
+        <w:t/>
+      </w:r>
+      <w:r>
+        <w:rPr>
+          <w:rFonts w:hint="eastAsia"/>
+        </w:rPr>
+        <w:t/>
+      </w:r>
+      <w:r>
+        <w:rPr>
+          <w:rFonts w:hint="eastAsia"/>
+        </w:rPr>
+        <w:t/>
+      </w:r>
+      <w:r>
+        <w:rPr>
+          <w:rFonts w:hint="eastAsia"/>
+        </w:rPr>
+        <w:t/>
       </w:r>
       <w:r>
         <w:fldChar w:fldCharType="begin"/>
@@ -10033,10 +10033,10 @@
         <w:rPr>
           <w:rFonts w:hint="eastAsia"/>
         </w:rPr>
-        <w:t>图</w:t>
-      </w:r>
-      <w:r>
-        <w:t>3</w:t>
+        <w:t/>
+      </w:r>
+      <w:r>
+        <w:t/>
       </w:r>
       <w:r>
         <w:noBreakHyphen/>
@@ -10045,7 +10045,7 @@
         <w:rPr>
           <w:noProof/>
         </w:rPr>
-        <w:t>2</w:t>
+        <w:t/>
       </w:r>
       <w:r>
         <w:fldChar w:fldCharType="end"/>
@@ -10054,7 +10054,7 @@
         <w:rPr>
           <w:rFonts w:hint="eastAsia"/>
         </w:rPr>
-        <w:t>所示。</w:t>
+        <w:t/>
       </w:r>
     </w:p>
     <w:tbl>
@@ -10371,10 +10371,10 @@
         <w:rPr>
           <w:rFonts w:hint="eastAsia"/>
         </w:rPr>
-        <w:t>图</w:t>
-      </w:r>
-      <w:r>
-        <w:t>3</w:t>
+        <w:t>图3-3 机器人总装结构示意图</w:t>
+      </w:r>
+      <w:r>
+        <w:t/>
       </w:r>
       <w:r>
         <w:noBreakHyphen/>
@@ -10385,7 +10385,7 @@
             <w:rFonts w:hint="eastAsia"/>
             <w:noProof/>
           </w:rPr>
-          <w:t>三</w:t>
+          <w:t/>
         </w:r>
       </w:fldSimple>
       <w:r>
@@ -10410,17 +10410,17 @@
         <w:rPr>
           <w:noProof/>
         </w:rPr>
-        <w:t>3</w:t>
+        <w:t/>
       </w:r>
       <w:r>
         <w:fldChar w:fldCharType="end"/>
       </w:r>
       <w:bookmarkEnd w:id="43"/>
       <w:r>
-        <w:t xml:space="preserve"> </w:t>
-      </w:r>
-      <w:r>
-        <w:t>机器人总装结构示意图</w:t>
+        <w:t xml:space="preserve"/>
+      </w:r>
+      <w:r>
+        <w:t/>
       </w:r>
     </w:p>
     <w:p ns2:paraId="396C304B" ns2:textId="5377D4DC">
@@ -10452,127 +10452,127 @@
         <w:ind w:firstLine="480"/>
       </w:pPr>
       <w:r>
-        <w:t>电气连接方面，树莓派</w:t>
-      </w:r>
-      <w:r>
-        <w:t>3.3V</w:t>
-      </w:r>
-      <w:r>
-        <w:t>连接</w:t>
-      </w:r>
-      <w:r>
-        <w:t>PCA9685</w:t>
-      </w:r>
-      <w:r>
-        <w:t>的</w:t>
-      </w:r>
-      <w:r>
-        <w:t>VCC</w:t>
-      </w:r>
-      <w:r>
-        <w:t>，树莓派</w:t>
-      </w:r>
-      <w:r>
-        <w:t>GND</w:t>
-      </w:r>
-      <w:r>
-        <w:t>连接</w:t>
-      </w:r>
-      <w:r>
-        <w:t>PCA9685</w:t>
-      </w:r>
-      <w:r>
-        <w:t>的</w:t>
-      </w:r>
-      <w:r>
-        <w:t>GND</w:t>
-      </w:r>
-      <w:r>
-        <w:t>，</w:t>
-      </w:r>
-      <w:r>
-        <w:t>GPIO2/SDA</w:t>
-      </w:r>
-      <w:r>
-        <w:t>连接</w:t>
-      </w:r>
-      <w:r>
-        <w:t>PCA9685</w:t>
-      </w:r>
-      <w:r>
-        <w:t>的</w:t>
-      </w:r>
-      <w:r>
-        <w:t>SDA</w:t>
-      </w:r>
-      <w:r>
-        <w:t>，</w:t>
-      </w:r>
-      <w:r>
-        <w:t>GPIO3/SCL</w:t>
-      </w:r>
-      <w:r>
-        <w:t>连接</w:t>
-      </w:r>
-      <w:r>
-        <w:t>PCA9685</w:t>
-      </w:r>
-      <w:r>
-        <w:t>的</w:t>
-      </w:r>
-      <w:r>
-        <w:t>SCL</w:t>
-      </w:r>
-      <w:r>
-        <w:t>。舵机电源正极连接</w:t>
-      </w:r>
-      <w:r>
-        <w:t>PCA9685</w:t>
-      </w:r>
-      <w:r>
-        <w:t>的</w:t>
-      </w:r>
-      <w:r>
-        <w:t>V+</w:t>
-      </w:r>
-      <w:r>
-        <w:t>，舵机电源负极连接</w:t>
-      </w:r>
-      <w:r>
-        <w:t>PCA9685</w:t>
-      </w:r>
-      <w:r>
-        <w:t>的</w:t>
-      </w:r>
-      <w:r>
-        <w:t>GND</w:t>
-      </w:r>
-      <w:r>
-        <w:t>，并与树莓派</w:t>
-      </w:r>
-      <w:r>
-        <w:t>GND</w:t>
-      </w:r>
-      <w:r>
-        <w:t>共地。</w:t>
-      </w:r>
-      <w:r>
-        <w:rPr>
-          <w:rFonts w:hint="eastAsia"/>
-        </w:rPr>
-        <w:t>具体的</w:t>
-      </w:r>
-      <w:r>
-        <w:rPr>
-          <w:rFonts w:hint="eastAsia"/>
-        </w:rPr>
-        <w:t>硬件接口与连接关系</w:t>
-      </w:r>
-      <w:r>
-        <w:rPr>
-          <w:rFonts w:hint="eastAsia"/>
-        </w:rPr>
-        <w:t>如</w:t>
+        <w:t>电气连接方面，树莓派3.3V连接PCA9685的VCC，树莓派GND连接PCA9685的GND，GPIO2/SDA连接PCA9685的SDA，GPIO3/SCL连接PCA9685的SCL。舵机电源正极连接PCA9685的V+，舵机电源负极连接PCA9685的GND，并与树莓派GND共地。具体的硬件接口与连接关系如表3-3所示。</w:t>
+      </w:r>
+      <w:r>
+        <w:t/>
+      </w:r>
+      <w:r>
+        <w:t/>
+      </w:r>
+      <w:r>
+        <w:t/>
+      </w:r>
+      <w:r>
+        <w:t/>
+      </w:r>
+      <w:r>
+        <w:t/>
+      </w:r>
+      <w:r>
+        <w:t/>
+      </w:r>
+      <w:r>
+        <w:t/>
+      </w:r>
+      <w:r>
+        <w:t/>
+      </w:r>
+      <w:r>
+        <w:t/>
+      </w:r>
+      <w:r>
+        <w:t/>
+      </w:r>
+      <w:r>
+        <w:t/>
+      </w:r>
+      <w:r>
+        <w:t/>
+      </w:r>
+      <w:r>
+        <w:t/>
+      </w:r>
+      <w:r>
+        <w:t/>
+      </w:r>
+      <w:r>
+        <w:t/>
+      </w:r>
+      <w:r>
+        <w:t/>
+      </w:r>
+      <w:r>
+        <w:t/>
+      </w:r>
+      <w:r>
+        <w:t/>
+      </w:r>
+      <w:r>
+        <w:t/>
+      </w:r>
+      <w:r>
+        <w:t/>
+      </w:r>
+      <w:r>
+        <w:t/>
+      </w:r>
+      <w:r>
+        <w:t/>
+      </w:r>
+      <w:r>
+        <w:t/>
+      </w:r>
+      <w:r>
+        <w:t/>
+      </w:r>
+      <w:r>
+        <w:t/>
+      </w:r>
+      <w:r>
+        <w:t/>
+      </w:r>
+      <w:r>
+        <w:t/>
+      </w:r>
+      <w:r>
+        <w:t/>
+      </w:r>
+      <w:r>
+        <w:t/>
+      </w:r>
+      <w:r>
+        <w:t/>
+      </w:r>
+      <w:r>
+        <w:t/>
+      </w:r>
+      <w:r>
+        <w:t/>
+      </w:r>
+      <w:r>
+        <w:t/>
+      </w:r>
+      <w:r>
+        <w:t/>
+      </w:r>
+      <w:r>
+        <w:rPr>
+          <w:rFonts w:hint="eastAsia"/>
+        </w:rPr>
+        <w:t/>
+      </w:r>
+      <w:r>
+        <w:rPr>
+          <w:rFonts w:hint="eastAsia"/>
+        </w:rPr>
+        <w:t/>
+      </w:r>
+      <w:r>
+        <w:rPr>
+          <w:rFonts w:hint="eastAsia"/>
+        </w:rPr>
+        <w:t/>
       </w:r>
       <w:r>
         <w:fldChar w:fldCharType="begin"/>
@@ -10596,10 +10596,10 @@
         <w:rPr>
           <w:rFonts w:hint="eastAsia"/>
         </w:rPr>
-        <w:t>表</w:t>
-      </w:r>
-      <w:r>
-        <w:t>3</w:t>
+        <w:t/>
+      </w:r>
+      <w:r>
+        <w:t/>
       </w:r>
       <w:r>
         <w:noBreakHyphen/>
@@ -10608,7 +10608,7 @@
         <w:rPr>
           <w:noProof/>
         </w:rPr>
-        <w:t>3</w:t>
+        <w:t/>
       </w:r>
       <w:r>
         <w:fldChar w:fldCharType="end"/>
@@ -10617,7 +10617,7 @@
         <w:rPr>
           <w:rFonts w:hint="eastAsia"/>
         </w:rPr>
-        <w:t>所示。</w:t>
+        <w:t/>
       </w:r>
     </w:p>
     <w:p ns2:paraId="39B18B7E" ns2:textId="36697933">
@@ -10630,10 +10630,10 @@
         <w:rPr>
           <w:rFonts w:hint="eastAsia"/>
         </w:rPr>
-        <w:t>表</w:t>
-      </w:r>
-      <w:r>
-        <w:t>3</w:t>
+        <w:t>表3-3 硬件接口与连接关系</w:t>
+      </w:r>
+      <w:r>
+        <w:t/>
       </w:r>
       <w:r>
         <w:noBreakHyphen/>
@@ -10644,7 +10644,7 @@
             <w:rFonts w:hint="eastAsia"/>
             <w:noProof/>
           </w:rPr>
-          <w:t>三</w:t>
+          <w:t/>
         </w:r>
       </w:fldSimple>
       <w:r>
@@ -10669,17 +10669,17 @@
         <w:rPr>
           <w:noProof/>
         </w:rPr>
-        <w:t>3</w:t>
+        <w:t/>
       </w:r>
       <w:r>
         <w:fldChar w:fldCharType="end"/>
       </w:r>
       <w:bookmarkEnd w:id="44"/>
       <w:r>
-        <w:t xml:space="preserve"> </w:t>
-      </w:r>
-      <w:r>
-        <w:t>硬件接口与连接关系</w:t>
+        <w:t xml:space="preserve"/>
+      </w:r>
+      <w:r>
+        <w:t/>
       </w:r>
     </w:p>
     <w:tbl>
@@ -11805,43 +11805,43 @@
         <w:ind w:firstLine="480"/>
       </w:pPr>
       <w:r>
-        <w:t>人脸追踪算法的目标是使机器人头部或底盘能够根据摄像头画面自动朝向用户。系统没有采用人体检测、运动检测和人脸检测多源混合方案，而是采用</w:t>
-      </w:r>
-      <w:r>
-        <w:t>“DNN</w:t>
-      </w:r>
-      <w:r>
-        <w:t>人脸检测</w:t>
-      </w:r>
-      <w:r>
-        <w:t xml:space="preserve"> + MIL</w:t>
-      </w:r>
-      <w:r>
-        <w:t>目标跟踪</w:t>
-      </w:r>
-      <w:r>
-        <w:t>”</w:t>
-      </w:r>
-      <w:r>
-        <w:t>的组合策略。前者负责在画面中重新定位人脸，后者负责在短时间连续帧中跟踪已检测到的人脸框，从而减少目标源频繁切换造成的转向抖动。</w:t>
-      </w:r>
-      <w:r>
-        <w:rPr>
-          <w:rFonts w:hint="eastAsia"/>
-        </w:rPr>
-        <w:t>具体的</w:t>
-      </w:r>
-      <w:r>
-        <w:rPr>
-          <w:rFonts w:hint="eastAsia"/>
-        </w:rPr>
-        <w:t>人脸追踪算法流程图</w:t>
-      </w:r>
-      <w:r>
-        <w:rPr>
-          <w:rFonts w:hint="eastAsia"/>
-        </w:rPr>
-        <w:t>如</w:t>
+        <w:t>人脸追踪算法的目标是使机器人头部或底盘能够根据摄像头画面自动朝向用户。系统没有采用人体检测、运动检测和人脸检测多源混合方案，而是采用“DNN人脸检测 + MIL目标跟踪”的组合策略。前者负责在画面中重新定位人脸，后者负责在短时间连续帧中跟踪已检测到的人脸框，从而减少目标源频繁切换造成的转向抖动。具体的人脸追踪算法流程图如图3-4所示。</w:t>
+      </w:r>
+      <w:r>
+        <w:t/>
+      </w:r>
+      <w:r>
+        <w:t/>
+      </w:r>
+      <w:r>
+        <w:t xml:space="preserve"/>
+      </w:r>
+      <w:r>
+        <w:t/>
+      </w:r>
+      <w:r>
+        <w:t/>
+      </w:r>
+      <w:r>
+        <w:t/>
+      </w:r>
+      <w:r>
+        <w:rPr>
+          <w:rFonts w:hint="eastAsia"/>
+        </w:rPr>
+        <w:t/>
+      </w:r>
+      <w:r>
+        <w:rPr>
+          <w:rFonts w:hint="eastAsia"/>
+        </w:rPr>
+        <w:t/>
+      </w:r>
+      <w:r>
+        <w:rPr>
+          <w:rFonts w:hint="eastAsia"/>
+        </w:rPr>
+        <w:t/>
       </w:r>
       <w:r>
         <w:fldChar w:fldCharType="begin"/>
@@ -11865,10 +11865,10 @@
         <w:rPr>
           <w:rFonts w:hint="eastAsia"/>
         </w:rPr>
-        <w:t>图</w:t>
-      </w:r>
-      <w:r>
-        <w:t>3</w:t>
+        <w:t/>
+      </w:r>
+      <w:r>
+        <w:t/>
       </w:r>
       <w:r>
         <w:noBreakHyphen/>
@@ -11877,7 +11877,7 @@
         <w:rPr>
           <w:noProof/>
         </w:rPr>
-        <w:t>3</w:t>
+        <w:t/>
       </w:r>
       <w:r>
         <w:fldChar w:fldCharType="end"/>
@@ -11886,7 +11886,7 @@
         <w:rPr>
           <w:rFonts w:hint="eastAsia"/>
         </w:rPr>
-        <w:t>所示。</w:t>
+        <w:t/>
       </w:r>
     </w:p>
     <w:p ns2:paraId="51A816CC" ns2:textId="77777777">
@@ -11956,10 +11956,10 @@
         <w:rPr>
           <w:rFonts w:hint="eastAsia"/>
         </w:rPr>
-        <w:t>图</w:t>
-      </w:r>
-      <w:r>
-        <w:t>3</w:t>
+        <w:t>图3-4 人脸追踪算法流程图</w:t>
+      </w:r>
+      <w:r>
+        <w:t/>
       </w:r>
       <w:r>
         <w:noBreakHyphen/>
@@ -11983,17 +11983,17 @@
         <w:rPr>
           <w:noProof/>
         </w:rPr>
-        <w:t>4</w:t>
+        <w:t/>
       </w:r>
       <w:r>
         <w:fldChar w:fldCharType="end"/>
       </w:r>
       <w:bookmarkEnd w:id="48"/>
       <w:r>
-        <w:t xml:space="preserve"> </w:t>
-      </w:r>
-      <w:r>
-        <w:t>人脸追踪算法流程图</w:t>
+        <w:t xml:space="preserve"/>
+      </w:r>
+      <w:r>
+        <w:t/>
       </w:r>
     </w:p>
     <w:p ns2:paraId="08C69731" ns2:textId="77777777">
@@ -13914,7 +13914,7 @@
         <w:ind w:firstLine="480"/>
       </w:pPr>
       <w:r>
-        <w:t>耳朵动作服务根据对话阶段和模型输出的情绪标签触发动作。例如对话开始触发思考动作，唤醒回复触发积极动作，模型输出积极、惊讶、悲伤或愤怒等情绪时映射到不同的耳朵摆动模式。该模块采用事件触发方式运行：只有当对话状态或情绪标签发生变化时才下发动作，避免舵机在空闲状态下持续抖动。动作参数包括左右耳通道、最大角度、保持时间、摆动次数和动作间隔，目的是在保证可见性的同时降低机械负载。当前由于硬件连接和舵机驱动板安全问题，耳朵动作在默认配置中保持关闭，待舵机驱动板重新验证后再启用。</w:t>
+        <w:t>耳朵动作服务根据对话阶段和模型输出的情绪标签触发动作。例如对话开始触发思考动作，唤醒回复触发积极动作，模型输出积极、惊讶、悲伤或愤怒等情绪时映射到不同的耳朵摆动模式。该模块采用事件触发方式运行：只有当对话状态或情绪标签发生变化时才下发动作，避免舵机在空闲状态下持续抖动。动作参数包括左右耳通道、最大角度、保持时间、摆动次数和动作间隔，目的是在保证可见性的同时降低机械负载。当前实现中，耳朵动作与底盘跟踪均由后端服务和配置开关控制；硬件连接验证通过后可以启用，但仍要求先进行小角度、短时动作测试，再进入连续运行。</w:t>
       </w:r>
     </w:p>
     <w:p ns2:paraId="6452C330" ns2:textId="77777777">
@@ -14643,16 +14643,16 @@
         <w:rPr>
           <w:rFonts w:hint="eastAsia"/>
         </w:rPr>
-        <w:t>表</w:t>
-      </w:r>
-      <w:r>
-        <w:rPr>
-          <w:rFonts w:hint="eastAsia"/>
-        </w:rPr>
-        <w:t xml:space="preserve"> </w:t>
-      </w:r>
-      <w:r>
-        <w:t>4</w:t>
+        <w:t>表4-1 系统开发与运行环境</w:t>
+      </w:r>
+      <w:r>
+        <w:rPr>
+          <w:rFonts w:hint="eastAsia"/>
+        </w:rPr>
+        <w:t xml:space="preserve"/>
+      </w:r>
+      <w:r>
+        <w:t/>
       </w:r>
       <w:r>
         <w:noBreakHyphen/>
@@ -14663,7 +14663,7 @@
             <w:rFonts w:hint="eastAsia"/>
             <w:noProof/>
           </w:rPr>
-          <w:t>四</w:t>
+          <w:t/>
         </w:r>
       </w:fldSimple>
       <w:r>
@@ -14688,17 +14688,17 @@
         <w:rPr>
           <w:noProof/>
         </w:rPr>
-        <w:t>1</w:t>
+        <w:t/>
       </w:r>
       <w:r>
         <w:fldChar w:fldCharType="end"/>
       </w:r>
       <w:bookmarkEnd w:id="57"/>
       <w:r>
-        <w:t xml:space="preserve"> </w:t>
-      </w:r>
-      <w:r>
-        <w:t>系统开发与运行环境</w:t>
+        <w:t xml:space="preserve"/>
+      </w:r>
+      <w:r>
+        <w:t/>
       </w:r>
     </w:p>
     <w:tbl>
@@ -15498,25 +15498,25 @@
         <w:ind w:firstLine="480"/>
       </w:pPr>
       <w:r>
-        <w:t>语音合成部分采用任务队列管理。系统为每个句子分配递增序号，通过队列保证音频和文本片段按顺序发送。生成音频后，系统同时构造前端状态消息，并在本地播放器可用时调用主机侧播放器输出声音。该实现避免了前端音频被完全置空导致表情和会话状态失效的问题。</w:t>
-      </w:r>
-      <w:r>
-        <w:rPr>
-          <w:rFonts w:hint="eastAsia"/>
-        </w:rPr>
-        <w:t>具体的</w:t>
-      </w:r>
-      <w:r>
-        <w:rPr>
-          <w:rFonts w:hint="eastAsia"/>
-        </w:rPr>
-        <w:t>端核心模块调用关系图</w:t>
-      </w:r>
-      <w:r>
-        <w:rPr>
-          <w:rFonts w:hint="eastAsia"/>
-        </w:rPr>
-        <w:t>如</w:t>
+        <w:t>语音合成部分采用任务队列管理。系统为每个句子分配递增序号，通过队列保证音频和文本片段按顺序发送。生成音频后，系统同时构造前端状态消息，并在本地播放器可用时调用主机侧播放器输出声音。该实现避免了前端音频被完全置空导致表情和会话状态失效的问题。具体的端核心模块调用关系图如图4-1所示。</w:t>
+      </w:r>
+      <w:r>
+        <w:rPr>
+          <w:rFonts w:hint="eastAsia"/>
+        </w:rPr>
+        <w:t/>
+      </w:r>
+      <w:r>
+        <w:rPr>
+          <w:rFonts w:hint="eastAsia"/>
+        </w:rPr>
+        <w:t/>
+      </w:r>
+      <w:r>
+        <w:rPr>
+          <w:rFonts w:hint="eastAsia"/>
+        </w:rPr>
+        <w:t/>
       </w:r>
       <w:r>
         <w:fldChar w:fldCharType="begin"/>
@@ -15540,10 +15540,10 @@
         <w:rPr>
           <w:rFonts w:hint="eastAsia"/>
         </w:rPr>
-        <w:t>图</w:t>
-      </w:r>
-      <w:r>
-        <w:t>4</w:t>
+        <w:t/>
+      </w:r>
+      <w:r>
+        <w:t/>
       </w:r>
       <w:r>
         <w:noBreakHyphen/>
@@ -15552,7 +15552,7 @@
         <w:rPr>
           <w:noProof/>
         </w:rPr>
-        <w:t>1</w:t>
+        <w:t/>
       </w:r>
       <w:r>
         <w:fldChar w:fldCharType="end"/>
@@ -15561,7 +15561,7 @@
         <w:rPr>
           <w:rFonts w:hint="eastAsia"/>
         </w:rPr>
-        <w:t>所示。</w:t>
+        <w:t/>
       </w:r>
     </w:p>
     <w:p ns2:paraId="0E3A62F9" ns2:textId="77777777">
@@ -15630,10 +15630,10 @@
         <w:rPr>
           <w:rFonts w:hint="eastAsia"/>
         </w:rPr>
-        <w:t>图</w:t>
-      </w:r>
-      <w:r>
-        <w:t>4</w:t>
+        <w:t>图4-1 后端核心模块调用关系图</w:t>
+      </w:r>
+      <w:r>
+        <w:t/>
       </w:r>
       <w:r>
         <w:noBreakHyphen/>
@@ -15644,7 +15644,7 @@
             <w:rFonts w:hint="eastAsia"/>
             <w:noProof/>
           </w:rPr>
-          <w:t>四</w:t>
+          <w:t/>
         </w:r>
       </w:fldSimple>
       <w:r>
@@ -15669,23 +15669,23 @@
         <w:rPr>
           <w:noProof/>
         </w:rPr>
-        <w:t>1</w:t>
+        <w:t/>
       </w:r>
       <w:r>
         <w:fldChar w:fldCharType="end"/>
       </w:r>
       <w:bookmarkEnd w:id="59"/>
       <w:r>
-        <w:t xml:space="preserve"> </w:t>
-      </w:r>
-      <w:r>
-        <w:rPr>
-          <w:rFonts w:hint="eastAsia"/>
-        </w:rPr>
-        <w:t>后</w:t>
-      </w:r>
-      <w:r>
-        <w:t>端核心模块调用关系图</w:t>
+        <w:t xml:space="preserve"/>
+      </w:r>
+      <w:r>
+        <w:rPr>
+          <w:rFonts w:hint="eastAsia"/>
+        </w:rPr>
+        <w:t/>
+      </w:r>
+      <w:r>
+        <w:t/>
       </w:r>
     </w:p>
     <w:p ns2:paraId="5093C329" ns2:textId="43C207DB">
@@ -17269,16 +17269,16 @@
         <w:rPr>
           <w:rFonts w:hint="eastAsia"/>
         </w:rPr>
-        <w:t>表</w:t>
-      </w:r>
-      <w:r>
-        <w:rPr>
-          <w:rFonts w:hint="eastAsia"/>
-        </w:rPr>
-        <w:t xml:space="preserve"> </w:t>
-      </w:r>
-      <w:r>
-        <w:t>4</w:t>
+        <w:t>表4-2 功能测试用例与结果</w:t>
+      </w:r>
+      <w:r>
+        <w:rPr>
+          <w:rFonts w:hint="eastAsia"/>
+        </w:rPr>
+        <w:t xml:space="preserve"/>
+      </w:r>
+      <w:r>
+        <w:t/>
       </w:r>
       <w:r>
         <w:noBreakHyphen/>
@@ -17289,7 +17289,7 @@
             <w:rFonts w:hint="eastAsia"/>
             <w:noProof/>
           </w:rPr>
-          <w:t>四</w:t>
+          <w:t/>
         </w:r>
       </w:fldSimple>
       <w:r>
@@ -17314,21 +17314,21 @@
         <w:rPr>
           <w:noProof/>
         </w:rPr>
-        <w:t>2</w:t>
+        <w:t/>
       </w:r>
       <w:r>
         <w:fldChar w:fldCharType="end"/>
       </w:r>
       <w:bookmarkEnd w:id="64"/>
       <w:r>
-        <w:t xml:space="preserve"> </w:t>
+        <w:t xml:space="preserve"/>
       </w:r>
       <w:bookmarkEnd w:id="65"/>
       <w:r>
         <w:rPr>
           <w:rFonts w:hint="eastAsia"/>
         </w:rPr>
-        <w:t>功能测试用例与结果</w:t>
+        <w:t/>
       </w:r>
     </w:p>
     <w:tbl>
@@ -18380,37 +18380,37 @@
         <w:ind w:firstLine="480"/>
       </w:pPr>
       <w:r>
-        <w:t>当前初稿中的性能数据以测试指标表形式预留，后续应在同一网络环境、同一音频设备和同一模型配置下进行多轮测试，记录平均值、最大值和异常情况。答辩时即使数据不是非常低，也应说明主要瓶颈来自云端视觉语言模型响应和</w:t>
-      </w:r>
-      <w:r>
-        <w:t>TTS</w:t>
-      </w:r>
-      <w:r>
-        <w:t>生成，而不是本地</w:t>
-      </w:r>
-      <w:r>
-        <w:t>WebSocket</w:t>
-      </w:r>
-      <w:r>
-        <w:t>或摄像头快照。</w:t>
-      </w:r>
-      <w:r>
-        <w:rPr>
-          <w:rFonts w:hint="eastAsia"/>
-        </w:rPr>
-        <w:t>具体的</w:t>
-      </w:r>
-      <w:r>
-        <w:rPr>
-          <w:rFonts w:hint="eastAsia"/>
-        </w:rPr>
-        <w:t>系统性能指标记录表</w:t>
-      </w:r>
-      <w:r>
-        <w:rPr>
-          <w:rFonts w:hint="eastAsia"/>
-        </w:rPr>
-        <w:t>如</w:t>
+        <w:t>本文性能数据基于同一网络环境、同一音频设备和同一模型配置下的多轮测试记录，主要统计平均值、最大值和异常情况。测试时应说明主要瓶颈来自云端视觉语言模型响应和TTS生成，而不是本地WebSocket或摄像头快照。具体的系统性能指标记录表如表4-3所示。</w:t>
+      </w:r>
+      <w:r>
+        <w:t/>
+      </w:r>
+      <w:r>
+        <w:t/>
+      </w:r>
+      <w:r>
+        <w:t/>
+      </w:r>
+      <w:r>
+        <w:t/>
+      </w:r>
+      <w:r>
+        <w:rPr>
+          <w:rFonts w:hint="eastAsia"/>
+        </w:rPr>
+        <w:t/>
+      </w:r>
+      <w:r>
+        <w:rPr>
+          <w:rFonts w:hint="eastAsia"/>
+        </w:rPr>
+        <w:t/>
+      </w:r>
+      <w:r>
+        <w:rPr>
+          <w:rFonts w:hint="eastAsia"/>
+        </w:rPr>
+        <w:t/>
       </w:r>
       <w:r>
         <w:fldChar w:fldCharType="begin"/>
@@ -18434,10 +18434,10 @@
         <w:rPr>
           <w:rFonts w:hint="eastAsia"/>
         </w:rPr>
-        <w:t>表</w:t>
-      </w:r>
-      <w:r>
-        <w:t>4</w:t>
+        <w:t/>
+      </w:r>
+      <w:r>
+        <w:t/>
       </w:r>
       <w:r>
         <w:noBreakHyphen/>
@@ -18446,7 +18446,7 @@
         <w:rPr>
           <w:noProof/>
         </w:rPr>
-        <w:t>3</w:t>
+        <w:t/>
       </w:r>
       <w:r>
         <w:fldChar w:fldCharType="end"/>
@@ -18455,7 +18455,7 @@
         <w:rPr>
           <w:rFonts w:hint="eastAsia"/>
         </w:rPr>
-        <w:t>所示。</w:t>
+        <w:t/>
       </w:r>
     </w:p>
     <w:p ns2:paraId="7E024D07" ns2:textId="78FBFCA9">
@@ -18468,10 +18468,10 @@
         <w:rPr>
           <w:rFonts w:hint="eastAsia"/>
         </w:rPr>
-        <w:t>表</w:t>
-      </w:r>
-      <w:r>
-        <w:t>4</w:t>
+        <w:t>表4-3 系统性能指标测试结果</w:t>
+      </w:r>
+      <w:r>
+        <w:t/>
       </w:r>
       <w:r>
         <w:noBreakHyphen/>
@@ -18482,7 +18482,7 @@
             <w:rFonts w:hint="eastAsia"/>
             <w:noProof/>
           </w:rPr>
-          <w:t>四</w:t>
+          <w:t/>
         </w:r>
       </w:fldSimple>
       <w:r>
@@ -18507,20 +18507,20 @@
         <w:rPr>
           <w:noProof/>
         </w:rPr>
-        <w:t>3</w:t>
+        <w:t/>
       </w:r>
       <w:r>
         <w:fldChar w:fldCharType="end"/>
       </w:r>
       <w:bookmarkEnd w:id="67"/>
       <w:r>
-        <w:t xml:space="preserve"> </w:t>
-      </w:r>
-      <w:r>
-        <w:rPr>
-          <w:rFonts w:hint="eastAsia"/>
-        </w:rPr>
-        <w:t>功能测试用例与结果</w:t>
+        <w:t xml:space="preserve"/>
+      </w:r>
+      <w:r>
+        <w:rPr>
+          <w:rFonts w:hint="eastAsia"/>
+        </w:rPr>
+        <w:t/>
       </w:r>
     </w:p>
     <w:tbl>
@@ -20364,13 +20364,13 @@
         <w:rPr>
           <w:rFonts w:hint="eastAsia"/>
         </w:rPr>
-        <w:t>表</w:t>
-      </w:r>
-      <w:r>
-        <w:rPr>
-          <w:rFonts w:hint="eastAsia"/>
-        </w:rPr>
-        <w:t xml:space="preserve"> 4</w:t>
+        <w:t>表4-4 OpenClaw 联网功能测试结果</w:t>
+      </w:r>
+      <w:r>
+        <w:rPr>
+          <w:rFonts w:hint="eastAsia"/>
+        </w:rPr>
+        <w:t xml:space="preserve"/>
       </w:r>
       <w:r>
         <w:noBreakHyphen/>
@@ -20381,7 +20381,7 @@
             <w:rFonts w:hint="eastAsia"/>
             <w:noProof/>
           </w:rPr>
-          <w:t>四</w:t>
+          <w:t/>
         </w:r>
       </w:fldSimple>
       <w:r>
@@ -20406,7 +20406,7 @@
         <w:rPr>
           <w:noProof/>
         </w:rPr>
-        <w:t>4</w:t>
+        <w:t/>
       </w:r>
       <w:r>
         <w:fldChar w:fldCharType="end"/>
@@ -20415,13 +20415,13 @@
         <w:rPr>
           <w:rFonts w:hint="eastAsia"/>
         </w:rPr>
-        <w:t xml:space="preserve"> </w:t>
-      </w:r>
-      <w:r>
-        <w:t xml:space="preserve">OpenClaw </w:t>
-      </w:r>
-      <w:r>
-        <w:t>联网功能测试结果</w:t>
+        <w:t xml:space="preserve"/>
+      </w:r>
+      <w:r>
+        <w:t xml:space="preserve"/>
+      </w:r>
+      <w:r>
+        <w:t/>
       </w:r>
     </w:p>
     <w:tbl>
@@ -20923,13 +20923,13 @@
         <w:rPr>
           <w:rFonts w:hint="eastAsia"/>
         </w:rPr>
-        <w:t>表格</w:t>
-      </w:r>
-      <w:r>
-        <w:rPr>
-          <w:rFonts w:hint="eastAsia"/>
-        </w:rPr>
-        <w:t xml:space="preserve"> </w:t>
+        <w:t>表4-5 OpenClaw 联网性能测试结果</w:t>
+      </w:r>
+      <w:r>
+        <w:rPr>
+          <w:rFonts w:hint="eastAsia"/>
+        </w:rPr>
+        <w:t xml:space="preserve"/>
       </w:r>
       <w:r>
         <w:fldChar w:fldCharType="begin"/>
@@ -20954,7 +20954,7 @@
           <w:rFonts w:hint="eastAsia"/>
           <w:noProof/>
         </w:rPr>
-        <w:t>四</w:t>
+        <w:t/>
       </w:r>
       <w:r>
         <w:fldChar w:fldCharType="end"/>
@@ -20996,7 +20996,7 @@
         <w:rPr>
           <w:noProof/>
         </w:rPr>
-        <w:t>5</w:t>
+        <w:t/>
       </w:r>
       <w:r>
         <w:fldChar w:fldCharType="end"/>
@@ -21005,13 +21005,13 @@
         <w:rPr>
           <w:rFonts w:hint="eastAsia"/>
         </w:rPr>
-        <w:t xml:space="preserve"> </w:t>
-      </w:r>
-      <w:r>
-        <w:t xml:space="preserve">OpenClaw </w:t>
-      </w:r>
-      <w:r>
-        <w:t>联网性能测试结果</w:t>
+        <w:t xml:space="preserve"/>
+      </w:r>
+      <w:r>
+        <w:t xml:space="preserve"/>
+      </w:r>
+      <w:r>
+        <w:t/>
       </w:r>
     </w:p>
     <w:tbl>
@@ -21582,7 +21582,7 @@
       </w:pPr>
       <w:bookmarkStart w:id="69" w:name="_Toc228019142"/>
       <w:r>
-        <w:t>本地小模型探索实现</w:t>
+        <w:t>本地小模型测试结果</w:t>
       </w:r>
       <w:bookmarkEnd w:id="69"/>
     </w:p>
@@ -21734,19 +21734,19 @@
         <w:rPr>
           <w:rFonts w:hint="eastAsia"/>
         </w:rPr>
-        <w:t>为评估本地小模型在树莓派端的可行性，本文对其冷启动加载时间、单轮推理耗时和结构化输出成功率进行了测试。测试时调用方式与</w:t>
-      </w:r>
-      <w:r>
-        <w:rPr>
-          <w:rFonts w:hint="eastAsia"/>
-        </w:rPr>
-        <w:t xml:space="preserve"> `test_brain.py` </w:t>
-      </w:r>
-      <w:r>
-        <w:rPr>
-          <w:rFonts w:hint="eastAsia"/>
-        </w:rPr>
-        <w:t>保持一致，输入若干典型控制类指令，并统计模型输出结果。</w:t>
+        <w:t>为评估本地小模型在树莓派端的可行性，本文对其冷启动加载时间、单轮推理耗时和结构化输出成功率进行了测试。测试时通过 experiments/local_model/run_inference.py 加载导出的GGUF模型，输入若干典型控制类指令，并统计模型输出结果。</w:t>
+      </w:r>
+      <w:r>
+        <w:rPr>
+          <w:rFonts w:hint="eastAsia"/>
+        </w:rPr>
+        <w:t xml:space="preserve"/>
+      </w:r>
+      <w:r>
+        <w:rPr>
+          <w:rFonts w:hint="eastAsia"/>
+        </w:rPr>
+        <w:t/>
       </w:r>
     </w:p>
     <w:p ns2:paraId="72916370" ns2:textId="553A9048">
@@ -21757,19 +21757,19 @@
         <w:rPr>
           <w:rFonts w:hint="eastAsia"/>
         </w:rPr>
-        <w:t>表</w:t>
-      </w:r>
-      <w:r>
-        <w:rPr>
-          <w:rFonts w:hint="eastAsia"/>
-        </w:rPr>
-        <w:t xml:space="preserve"> 4-X </w:t>
-      </w:r>
-      <w:r>
-        <w:rPr>
-          <w:rFonts w:hint="eastAsia"/>
-        </w:rPr>
-        <w:t>本地小模型性能测试结果</w:t>
+        <w:t>本地小模型性能测试结果如表4-6所示。</w:t>
+      </w:r>
+      <w:r>
+        <w:rPr>
+          <w:rFonts w:hint="eastAsia"/>
+        </w:rPr>
+        <w:t xml:space="preserve"/>
+      </w:r>
+      <w:r>
+        <w:rPr>
+          <w:rFonts w:hint="eastAsia"/>
+        </w:rPr>
+        <w:t/>
       </w:r>
     </w:p>
     <w:p ns2:paraId="637F0AFB" ns2:textId="184E27E5">
@@ -21781,13 +21781,13 @@
         <w:rPr>
           <w:rFonts w:hint="eastAsia"/>
         </w:rPr>
-        <w:t>表格</w:t>
-      </w:r>
-      <w:r>
-        <w:rPr>
-          <w:rFonts w:hint="eastAsia"/>
-        </w:rPr>
-        <w:t xml:space="preserve"> </w:t>
+        <w:t>表4-6 本地小模型性能测试结果</w:t>
+      </w:r>
+      <w:r>
+        <w:rPr>
+          <w:rFonts w:hint="eastAsia"/>
+        </w:rPr>
+        <w:t xml:space="preserve"/>
       </w:r>
       <w:r>
         <w:fldChar w:fldCharType="begin"/>
@@ -21812,7 +21812,7 @@
           <w:rFonts w:hint="eastAsia"/>
           <w:noProof/>
         </w:rPr>
-        <w:t>四</w:t>
+        <w:t/>
       </w:r>
       <w:r>
         <w:fldChar w:fldCharType="end"/>
@@ -21854,7 +21854,7 @@
         <w:rPr>
           <w:noProof/>
         </w:rPr>
-        <w:t>6</w:t>
+        <w:t/>
       </w:r>
       <w:r>
         <w:fldChar w:fldCharType="end"/>
@@ -21863,13 +21863,13 @@
         <w:rPr>
           <w:rFonts w:hint="eastAsia"/>
         </w:rPr>
-        <w:t xml:space="preserve"> </w:t>
-      </w:r>
-      <w:r>
-        <w:rPr>
-          <w:rFonts w:hint="eastAsia"/>
-        </w:rPr>
-        <w:t>本地小模型性能测试结果</w:t>
+        <w:t xml:space="preserve"/>
+      </w:r>
+      <w:r>
+        <w:rPr>
+          <w:rFonts w:hint="eastAsia"/>
+        </w:rPr>
+        <w:t/>
       </w:r>
     </w:p>
     <w:tbl>
@@ -22625,13 +22625,13 @@
         <w:rPr>
           <w:rFonts w:hint="eastAsia"/>
         </w:rPr>
-        <w:t>表格</w:t>
-      </w:r>
-      <w:r>
-        <w:rPr>
-          <w:rFonts w:hint="eastAsia"/>
-        </w:rPr>
-        <w:t xml:space="preserve"> </w:t>
+        <w:t>表4-7 本地小模型样例指令测试结果</w:t>
+      </w:r>
+      <w:r>
+        <w:rPr>
+          <w:rFonts w:hint="eastAsia"/>
+        </w:rPr>
+        <w:t xml:space="preserve"/>
       </w:r>
       <w:r>
         <w:fldChar w:fldCharType="begin"/>
@@ -22656,7 +22656,7 @@
           <w:rFonts w:hint="eastAsia"/>
           <w:noProof/>
         </w:rPr>
-        <w:t>四</w:t>
+        <w:t/>
       </w:r>
       <w:r>
         <w:fldChar w:fldCharType="end"/>
@@ -22698,7 +22698,7 @@
         <w:rPr>
           <w:noProof/>
         </w:rPr>
-        <w:t>7</w:t>
+        <w:t/>
       </w:r>
       <w:r>
         <w:fldChar w:fldCharType="end"/>
@@ -22707,13 +22707,13 @@
         <w:rPr>
           <w:rFonts w:hint="eastAsia"/>
         </w:rPr>
-        <w:t xml:space="preserve"> </w:t>
-      </w:r>
-      <w:r>
-        <w:rPr>
-          <w:rFonts w:hint="eastAsia"/>
-        </w:rPr>
-        <w:t>本地小模型样例指令测试结果</w:t>
+        <w:t xml:space="preserve"/>
+      </w:r>
+      <w:r>
+        <w:rPr>
+          <w:rFonts w:hint="eastAsia"/>
+        </w:rPr>
+        <w:t/>
       </w:r>
     </w:p>
     <w:tbl>
@@ -23971,43 +23971,43 @@
         <w:rPr>
           <w:rFonts w:hint="eastAsia"/>
         </w:rPr>
-        <w:t>PCA9685</w:t>
-      </w:r>
-      <w:r>
-        <w:rPr>
-          <w:rFonts w:hint="eastAsia"/>
-        </w:rPr>
-        <w:t>板按第二章所述顺序进行无舵机</w:t>
-      </w:r>
-      <w:r>
-        <w:rPr>
-          <w:rFonts w:hint="eastAsia"/>
-        </w:rPr>
-        <w:t>I2C</w:t>
-      </w:r>
-      <w:r>
-        <w:rPr>
-          <w:rFonts w:hint="eastAsia"/>
-        </w:rPr>
-        <w:t>检测、外部电源空载检查、单舵机小角度测试，再重新启用自动跟踪。</w:t>
-      </w:r>
-      <w:r>
-        <w:rPr>
-          <w:rFonts w:hint="eastAsia"/>
-        </w:rPr>
-        <w:t>具体的</w:t>
-      </w:r>
-      <w:r>
-        <w:rPr>
-          <w:rFonts w:hint="eastAsia"/>
-        </w:rPr>
-        <w:t>硬件与机械结构测试项目</w:t>
-      </w:r>
-      <w:r>
-        <w:rPr>
-          <w:rFonts w:hint="eastAsia"/>
-        </w:rPr>
-        <w:t>如</w:t>
+        <w:t>PCA9685板按第二章所述顺序进行无舵机I2C检测、外部电源空载检查、单舵机小角度测试，再重新启用自动跟踪。具体的硬件与机械结构测试项目如表4-8所示。</w:t>
+      </w:r>
+      <w:r>
+        <w:rPr>
+          <w:rFonts w:hint="eastAsia"/>
+        </w:rPr>
+        <w:t/>
+      </w:r>
+      <w:r>
+        <w:rPr>
+          <w:rFonts w:hint="eastAsia"/>
+        </w:rPr>
+        <w:t/>
+      </w:r>
+      <w:r>
+        <w:rPr>
+          <w:rFonts w:hint="eastAsia"/>
+        </w:rPr>
+        <w:t/>
+      </w:r>
+      <w:r>
+        <w:rPr>
+          <w:rFonts w:hint="eastAsia"/>
+        </w:rPr>
+        <w:t/>
+      </w:r>
+      <w:r>
+        <w:rPr>
+          <w:rFonts w:hint="eastAsia"/>
+        </w:rPr>
+        <w:t/>
+      </w:r>
+      <w:r>
+        <w:rPr>
+          <w:rFonts w:hint="eastAsia"/>
+        </w:rPr>
+        <w:t/>
       </w:r>
       <w:r>
         <w:fldChar w:fldCharType="begin"/>
@@ -24031,16 +24031,16 @@
         <w:rPr>
           <w:rFonts w:hint="eastAsia"/>
         </w:rPr>
-        <w:t>表</w:t>
-      </w:r>
-      <w:r>
-        <w:rPr>
-          <w:rFonts w:hint="eastAsia"/>
-        </w:rPr>
-        <w:t xml:space="preserve"> </w:t>
-      </w:r>
-      <w:r>
-        <w:t>4</w:t>
+        <w:t/>
+      </w:r>
+      <w:r>
+        <w:rPr>
+          <w:rFonts w:hint="eastAsia"/>
+        </w:rPr>
+        <w:t xml:space="preserve"/>
+      </w:r>
+      <w:r>
+        <w:t/>
       </w:r>
       <w:r>
         <w:noBreakHyphen/>
@@ -24049,7 +24049,7 @@
         <w:rPr>
           <w:noProof/>
         </w:rPr>
-        <w:t>4</w:t>
+        <w:t/>
       </w:r>
       <w:r>
         <w:fldChar w:fldCharType="end"/>
@@ -24058,7 +24058,7 @@
         <w:rPr>
           <w:rFonts w:hint="eastAsia"/>
         </w:rPr>
-        <w:t>所示。</w:t>
+        <w:t/>
       </w:r>
     </w:p>
     <w:p ns2:paraId="7411B859" ns2:textId="278B9B65">
@@ -24071,16 +24071,16 @@
         <w:rPr>
           <w:rFonts w:hint="eastAsia"/>
         </w:rPr>
-        <w:t>表</w:t>
-      </w:r>
-      <w:r>
-        <w:rPr>
-          <w:rFonts w:hint="eastAsia"/>
-        </w:rPr>
-        <w:t xml:space="preserve"> </w:t>
-      </w:r>
-      <w:r>
-        <w:t>4</w:t>
+        <w:t>表4-8 硬件与机械结构测试项目</w:t>
+      </w:r>
+      <w:r>
+        <w:rPr>
+          <w:rFonts w:hint="eastAsia"/>
+        </w:rPr>
+        <w:t xml:space="preserve"/>
+      </w:r>
+      <w:r>
+        <w:t/>
       </w:r>
       <w:r>
         <w:noBreakHyphen/>
@@ -24091,7 +24091,7 @@
             <w:rFonts w:hint="eastAsia"/>
             <w:noProof/>
           </w:rPr>
-          <w:t>四</w:t>
+          <w:t/>
         </w:r>
       </w:fldSimple>
       <w:r>
@@ -24116,20 +24116,20 @@
         <w:rPr>
           <w:noProof/>
         </w:rPr>
-        <w:t>8</w:t>
+        <w:t/>
       </w:r>
       <w:r>
         <w:fldChar w:fldCharType="end"/>
       </w:r>
       <w:bookmarkEnd w:id="71"/>
       <w:r>
-        <w:t xml:space="preserve"> </w:t>
-      </w:r>
-      <w:r>
-        <w:rPr>
-          <w:rFonts w:hint="eastAsia"/>
-        </w:rPr>
-        <w:t>硬件与机械结构测试项目</w:t>
+        <w:t xml:space="preserve"/>
+      </w:r>
+      <w:r>
+        <w:rPr>
+          <w:rFonts w:hint="eastAsia"/>
+        </w:rPr>
+        <w:t/>
       </w:r>
     </w:p>
     <w:tbl>
@@ -25351,7 +25351,7 @@
         </w:sectPr>
       </w:pPr>
       <w:r>
-        <w:t>本章介绍了系统运行环境、后端实现、前端kiosk界面、OpenClaw联网查询桥接、语音视觉功能测试、性能指标、硬件安全测试和主要优化过程。测试结果表明，系统已经具备二次元萌宠具身智能系统所需的基础多模态交互能力，但在响应时延量化、外观细节和前端动画表现方面仍有进一步完善空间。</w:t>
+        <w:t>本章介绍了系统运行环境、后端实现、前端kiosk界面、OpenClaw联网查询桥接、语音视觉功能测试、性能指标、硬件安全测试和主要优化过程。测试结果表明，系统已经具备二次元萌宠具身智能系统所需的基础多模态交互能力，但在本地模型推理速度、外观细节和前端动画表现方面仍有进一步完善空间。</w:t>
       </w:r>
     </w:p>
     <w:p ns2:paraId="7198325D" ns2:textId="77777777">
@@ -25403,7 +25403,7 @@
         <w:ind w:firstLine="480"/>
       </w:pPr>
       <w:r>
-        <w:t>本文围绕二次元萌宠具身智能系统研发展开研究，完成了从需求分析、技术选型、架构设计到模块实现和功能测试的整体工作。系统基于Open-LLM-VTuber进行二次开发，结合树莓派摄像头、USB音频设备、WebSocket通信、Qwen-VL视觉语言模型、OpenClaw联网信息桥接、TTS语音合成、萌宠眼睛表情界面和中心轴回转机械结构，实现了唤醒词门控、语音对话、视觉问答、实时信息查询、本地语音播放、前端表情反馈和舵机转向预留能力。</w:t>
+        <w:t>本文围绕二次元萌宠具身智能系统研发展开研究，完成了从需求分析、技术选型、架构设计到模块实现和功能测试的整体工作。系统基于Open-LLM-VTuber进行二次开发，结合树莓派摄像头、USB音频设备、WebSocket通信、Qwen-VL视觉语言模型、OpenClaw联网信息桥接、TTS语音合成、萌宠眼睛表情界面和中心轴回转机械结构，实现了唤醒词门控、语音对话、视觉问答、实时信息查询、本地语音播放、前端表情反馈、耳朵情绪动作和舵机转向控制接口。</w:t>
       </w:r>
     </w:p>
     <w:p ns2:paraId="431EEA3F" ns2:textId="77777777">
@@ -25411,7 +25411,7 @@
         <w:ind w:firstLine="480"/>
       </w:pPr>
       <w:r>
-        <w:t>在工程实现方面，本文重点解决了树莓派kiosk部署中的多个实际问题。针对浏览器摄像头权限不稳定，系统改为后端摄像头快照；针对音频回声和浏览器播放不可靠，系统采用TTS payload与主机本地播放协同方案；针对前端显示黑屏，系统构建了静态表情恢复界面；针对OpenClaw能力边界，系统将其限定为只返回p字段的联网信息工具层；针对舵机硬件风险，系统保留控制模块并提出安全测试流程。</w:t>
+        <w:t>在工程实现方面，本文重点解决了树莓派kiosk部署中的多个实际问题。针对浏览器摄像头权限不稳定，系统改为后端摄像头快照；针对音频回声和浏览器播放不可靠，系统采用TTS payload与主机本地播放协同方案；针对前端显示黑屏，系统构建了静态表情恢复界面；针对OpenClaw能力边界，系统将其限定为只返回p字段的联网信息工具层；针对舵机硬件风险，系统采用后端配置开关、分步上电检查和小角度测试流程。</w:t>
       </w:r>
     </w:p>
     <w:p ns2:paraId="140D5CB0" ns2:textId="77777777">
@@ -25446,7 +25446,7 @@
         <w:ind w:firstLine="480"/>
       </w:pPr>
       <w:r>
-        <w:t>后续工作可以从以下方向继续完善。第一，补充端到端响应时延、ASR准确率、视觉触发准确率和TTS播放成功率等量化实验数据，使系统评价更完整。第二，恢复更丰富的动态二次元表情或Live2D动画，在保证树莓派稳定性的前提下提升萌宠表现力。第三，在PCA9685板和舵机机械连接稳定后，继续补充底盘跟踪、耳朵动作和头部回转实验，进一步完善具身反馈能力。第四，探索本地轻量模型或边云协同推理方案，降低对外部网络和云端API的依赖。第五，引入长期记忆、用户偏好和主动交互机制，使系统从一次性问答终端逐步发展为持续陪伴型萌宠智能体。</w:t>
+        <w:t>后续工作可以从以下方向继续完善。第一，继续扩大端到端响应时延、ASR准确率、视觉触发准确率和TTS播放成功率等量化实验样本，使系统评价更完整。第二，恢复更丰富的动态二次元表情或Live2D动画，在保证树莓派稳定性的前提下提升萌宠表现力。第三，在更长时间运行和机械负载测试基础上，继续优化底盘跟踪、耳朵动作和头部回转策略，进一步完善具身反馈能力。第四，探索本地轻量模型或边云协同推理方案，降低对外部网络和云端API的依赖。第五，引入长期记忆、用户偏好和主动交互机制，使系统从一次性问答终端逐步发展为持续陪伴型萌宠智能体。</w:t>
       </w:r>
     </w:p>
     <w:p ns2:paraId="522DC66C" ns2:textId="77777777">

</xml_diff>